<commit_message>
Remove resume footer note
</commit_message>
<xml_diff>
--- a/output/Nick_Cinera_Resume.docx
+++ b/output/Nick_Cinera_Resume.docx
@@ -1165,18 +1165,7 @@
   <w:p>
     <w:pPr>
       <w:pStyle w:val="Footer"/>
-      <w:jc w:val="center"/>
-    </w:pPr>
-    <w:r>
-      <w:rPr>
-        <w:rFonts w:ascii="Aptos" w:hAnsi="Aptos"/>
-        <w:b w:val="0"/>
-        <w:i w:val="0"/>
-        <w:color w:val="535B66"/>
-        <w:sz w:val="14"/>
-      </w:rPr>
-      <w:t>Resume tailored for trading-system, low-latency UI, and full-stack capital-markets engineering interviews.</w:t>
-    </w:r>
+    </w:pPr>
   </w:p>
 </w:ftr>
 </file>

</xml_diff>

<commit_message>
Refresh public resume and website
</commit_message>
<xml_diff>
--- a/output/Nick_Cinera_Resume.docx
+++ b/output/Nick_Cinera_Resume.docx
@@ -31,12 +31,12 @@
           <w:color w:val="00587A"/>
           <w:sz w:val="19"/>
         </w:rPr>
-        <w:t>Full-Stack Trading Systems Engineer | Low-Latency UI, Event-Driven Architecture, Capital Markets</w:t>
+        <w:t>Trading Systems Engineer | High-Performance UI, Real-Time Data &amp; Distributed Systems</w:t>
       </w:r>
     </w:p>
     <w:p>
       <w:pPr>
-        <w:spacing w:after="60"/>
+        <w:spacing w:after="68"/>
         <w:jc w:val="center"/>
       </w:pPr>
       <w:r>
@@ -52,7 +52,7 @@
     </w:p>
     <w:p>
       <w:pPr>
-        <w:spacing w:after="80"/>
+        <w:spacing w:after="88" w:line="250" w:lineRule="auto"/>
         <w:jc w:val="center"/>
       </w:pPr>
       <w:r>
@@ -61,14 +61,14 @@
           <w:b w:val="0"/>
           <w:i w:val="0"/>
           <w:color w:val="171D24"/>
-          <w:sz w:val="16"/>
+          <w:sz w:val="17"/>
         </w:rPr>
-        <w:t>Goldman Sachs engineer building latency-sensitive trading platforms across React, TypeScript, Redux, AG Grid, Java, and WebSocket. Owns production workflows end-to-end: low-latency UI rendering, event-driven distributed systems, server-authoritative streaming models, feature-canary migrations, release configuration, and trader-facing reliability. Adept at using AI workflows and agentic coding systems to accelerate codebase navigation, design exploration, debugging, test generation, and technical writing while keeping validation rigorous.</w:t>
+        <w:t>Software engineer at Goldman Sachs building latency-sensitive equity-derivatives and capital-markets platforms used by traders and deal teams. Owns React/TypeScript/AG Grid interfaces through Java/WebSocket services and production rollout, with deep experience in real-time state, large data grids, event-driven architecture, and controlled migration of desk-critical workflows.</w:t>
       </w:r>
     </w:p>
     <w:p>
       <w:pPr>
-        <w:spacing w:before="80" w:after="30"/>
+        <w:spacing w:before="104" w:after="40"/>
         <w:pBdr>
           <w:bottom w:val="single" w:sz="6" w:space="2" w:color="B9C3CF"/>
         </w:pBdr>
@@ -81,371 +81,116 @@
           <w:color w:val="00587A"/>
           <w:sz w:val="19"/>
         </w:rPr>
-        <w:t>CORE STRENGTHS</w:t>
+        <w:t>TECHNICAL EXPERTISE</w:t>
       </w:r>
     </w:p>
-    <w:tbl>
-      <w:tblPr>
-        <w:tblW w:type="dxa" w:w="10872"/>
-        <w:jc w:val="center"/>
-        <w:tblLook w:firstColumn="1" w:firstRow="1" w:lastColumn="0" w:lastRow="0" w:noHBand="0" w:noVBand="1" w:val="04A0"/>
-        <w:tblBorders>
-          <w:top w:val="single" w:sz="3" w:space="0" w:color="E1E6EC"/>
-          <w:left w:val="single" w:sz="3" w:space="0" w:color="E1E6EC"/>
-          <w:bottom w:val="single" w:sz="3" w:space="0" w:color="E1E6EC"/>
-          <w:right w:val="single" w:sz="3" w:space="0" w:color="E1E6EC"/>
-          <w:insideH w:val="single" w:sz="3" w:space="0" w:color="E1E6EC"/>
-          <w:insideV w:val="single" w:sz="3" w:space="0" w:color="E1E6EC"/>
-        </w:tblBorders>
-      </w:tblPr>
-      <w:tblGrid>
-        <w:gridCol w:w="3629"/>
-        <w:gridCol w:w="3629"/>
-        <w:gridCol w:w="3629"/>
-      </w:tblGrid>
-      <w:tr>
-        <w:tc>
-          <w:tcPr>
-            <w:tcW w:type="dxa" w:w="3629"/>
-            <w:tcMar>
-              <w:top w:w="55" w:type="dxa"/>
-              <w:start w:w="70" w:type="dxa"/>
-              <w:bottom w:w="55" w:type="dxa"/>
-              <w:end w:w="70" w:type="dxa"/>
-            </w:tcMar>
-            <w:shd w:fill="F7F9FB"/>
-          </w:tcPr>
-          <w:p>
-            <w:pPr>
-              <w:spacing w:after="0"/>
-            </w:pPr>
-            <w:r>
-              <w:rPr>
-                <w:rFonts w:ascii="Aptos" w:hAnsi="Aptos"/>
-                <w:b/>
-                <w:i w:val="0"/>
-                <w:color w:val="00587A"/>
-                <w:sz w:val="15"/>
-              </w:rPr>
-              <w:t xml:space="preserve">Trading Systems: </w:t>
-            </w:r>
-            <w:r>
-              <w:rPr>
-                <w:rFonts w:ascii="Aptos" w:hAnsi="Aptos"/>
-                <w:b w:val="0"/>
-                <w:i w:val="0"/>
-                <w:color w:val="171D24"/>
-                <w:sz w:val="15"/>
-              </w:rPr>
-              <w:t>Equity derivatives RFQ/RFS, DCM new issue workflows, pricing grids, P&amp;L / fees, investor analytics</w:t>
-            </w:r>
-          </w:p>
-        </w:tc>
-        <w:tc>
-          <w:tcPr>
-            <w:tcW w:type="dxa" w:w="3629"/>
-            <w:tcMar>
-              <w:top w:w="55" w:type="dxa"/>
-              <w:start w:w="70" w:type="dxa"/>
-              <w:bottom w:w="55" w:type="dxa"/>
-              <w:end w:w="70" w:type="dxa"/>
-            </w:tcMar>
-            <w:shd w:fill="F7F9FB"/>
-          </w:tcPr>
-          <w:p>
-            <w:pPr>
-              <w:spacing w:after="0"/>
-            </w:pPr>
-            <w:r>
-              <w:rPr>
-                <w:rFonts w:ascii="Aptos" w:hAnsi="Aptos"/>
-                <w:b/>
-                <w:i w:val="0"/>
-                <w:color w:val="00587A"/>
-                <w:sz w:val="15"/>
-              </w:rPr>
-              <w:t xml:space="preserve">Frontend Architecture: </w:t>
-            </w:r>
-            <w:r>
-              <w:rPr>
-                <w:rFonts w:ascii="Aptos" w:hAnsi="Aptos"/>
-                <w:b w:val="0"/>
-                <w:i w:val="0"/>
-                <w:color w:val="171D24"/>
-                <w:sz w:val="15"/>
-              </w:rPr>
-              <w:t>React, TypeScript, Redux Toolkit, redux-observable / RxJS, AG Grid Enterprise, Cypress, Jest, Karma/Jasmine</w:t>
-            </w:r>
-          </w:p>
-        </w:tc>
-        <w:tc>
-          <w:tcPr>
-            <w:tcW w:type="dxa" w:w="3629"/>
-            <w:tcMar>
-              <w:top w:w="55" w:type="dxa"/>
-              <w:start w:w="70" w:type="dxa"/>
-              <w:bottom w:w="55" w:type="dxa"/>
-              <w:end w:w="70" w:type="dxa"/>
-            </w:tcMar>
-            <w:shd w:fill="F7F9FB"/>
-          </w:tcPr>
-          <w:p>
-            <w:pPr>
-              <w:spacing w:after="0"/>
-            </w:pPr>
-            <w:r>
-              <w:rPr>
-                <w:rFonts w:ascii="Aptos" w:hAnsi="Aptos"/>
-                <w:b/>
-                <w:i w:val="0"/>
-                <w:color w:val="00587A"/>
-                <w:sz w:val="15"/>
-              </w:rPr>
-              <w:t xml:space="preserve">Backend &amp; Platform: </w:t>
-            </w:r>
-            <w:r>
-              <w:rPr>
-                <w:rFonts w:ascii="Aptos" w:hAnsi="Aptos"/>
-                <w:b w:val="0"/>
-                <w:i w:val="0"/>
-                <w:color w:val="171D24"/>
-                <w:sz w:val="15"/>
-              </w:rPr>
-              <w:t>Java, WebSocket streaming, REST APIs, distributed systems, Node.js, Python, Go, SQL, Docker, AWS, CI/CD</w:t>
-            </w:r>
-          </w:p>
-        </w:tc>
-      </w:tr>
-      <w:tr>
-        <w:tc>
-          <w:tcPr>
-            <w:tcW w:type="dxa" w:w="3629"/>
-            <w:tcMar>
-              <w:top w:w="55" w:type="dxa"/>
-              <w:start w:w="70" w:type="dxa"/>
-              <w:bottom w:w="55" w:type="dxa"/>
-              <w:end w:w="70" w:type="dxa"/>
-            </w:tcMar>
-            <w:shd w:fill="FFFFFF"/>
-          </w:tcPr>
-          <w:p>
-            <w:pPr>
-              <w:spacing w:after="0"/>
-            </w:pPr>
-            <w:r>
-              <w:rPr>
-                <w:rFonts w:ascii="Aptos" w:hAnsi="Aptos"/>
-                <w:b/>
-                <w:i w:val="0"/>
-                <w:color w:val="00587A"/>
-                <w:sz w:val="15"/>
-              </w:rPr>
-              <w:t xml:space="preserve">Performance: </w:t>
-            </w:r>
-            <w:r>
-              <w:rPr>
-                <w:rFonts w:ascii="Aptos" w:hAnsi="Aptos"/>
-                <w:b w:val="0"/>
-                <w:i w:val="0"/>
-                <w:color w:val="171D24"/>
-                <w:sz w:val="15"/>
-              </w:rPr>
-              <w:t>Low-latency frontend performance, large-grid rendering, diff-based streaming, state synchronization, payload reduction</w:t>
-            </w:r>
-          </w:p>
-        </w:tc>
-        <w:tc>
-          <w:tcPr>
-            <w:tcW w:type="dxa" w:w="3629"/>
-            <w:tcMar>
-              <w:top w:w="55" w:type="dxa"/>
-              <w:start w:w="70" w:type="dxa"/>
-              <w:bottom w:w="55" w:type="dxa"/>
-              <w:end w:w="70" w:type="dxa"/>
-            </w:tcMar>
-            <w:shd w:fill="FFFFFF"/>
-          </w:tcPr>
-          <w:p>
-            <w:pPr>
-              <w:spacing w:after="0"/>
-            </w:pPr>
-            <w:r>
-              <w:rPr>
-                <w:rFonts w:ascii="Aptos" w:hAnsi="Aptos"/>
-                <w:b/>
-                <w:i w:val="0"/>
-                <w:color w:val="00587A"/>
-                <w:sz w:val="15"/>
-              </w:rPr>
-              <w:t xml:space="preserve">Ownership: </w:t>
-            </w:r>
-            <w:r>
-              <w:rPr>
-                <w:rFonts w:ascii="Aptos" w:hAnsi="Aptos"/>
-                <w:b w:val="0"/>
-                <w:i w:val="0"/>
-                <w:color w:val="171D24"/>
-                <w:sz w:val="15"/>
-              </w:rPr>
-              <w:t>End-to-end product delivery, cross-team release engineering, migration planning, production hardening</w:t>
-            </w:r>
-          </w:p>
-        </w:tc>
-        <w:tc>
-          <w:tcPr>
-            <w:tcW w:type="dxa" w:w="3629"/>
-            <w:tcMar>
-              <w:top w:w="55" w:type="dxa"/>
-              <w:start w:w="70" w:type="dxa"/>
-              <w:bottom w:w="55" w:type="dxa"/>
-              <w:end w:w="70" w:type="dxa"/>
-            </w:tcMar>
-            <w:shd w:fill="FFFFFF"/>
-          </w:tcPr>
-          <w:p>
-            <w:pPr>
-              <w:spacing w:after="0"/>
-            </w:pPr>
-            <w:r>
-              <w:rPr>
-                <w:rFonts w:ascii="Aptos" w:hAnsi="Aptos"/>
-                <w:b/>
-                <w:i w:val="0"/>
-                <w:color w:val="00587A"/>
-                <w:sz w:val="15"/>
-              </w:rPr>
-              <w:t xml:space="preserve">Foundations: </w:t>
-            </w:r>
-            <w:r>
-              <w:rPr>
-                <w:rFonts w:ascii="Aptos" w:hAnsi="Aptos"/>
-                <w:b w:val="0"/>
-                <w:i w:val="0"/>
-                <w:color w:val="171D24"/>
-                <w:sz w:val="15"/>
-              </w:rPr>
-              <w:t>Algorithms, C/C++, Java certification, machine-learning graduate study, competitive-programming leadership</w:t>
-            </w:r>
-          </w:p>
-        </w:tc>
-      </w:tr>
-      <w:tr>
-        <w:tc>
-          <w:tcPr>
-            <w:tcW w:type="dxa" w:w="3629"/>
-            <w:tcMar>
-              <w:top w:w="55" w:type="dxa"/>
-              <w:start w:w="70" w:type="dxa"/>
-              <w:bottom w:w="55" w:type="dxa"/>
-              <w:end w:w="70" w:type="dxa"/>
-            </w:tcMar>
-            <w:shd w:fill="F7F9FB"/>
-          </w:tcPr>
-          <w:p>
-            <w:pPr>
-              <w:spacing w:after="0"/>
-            </w:pPr>
-            <w:r>
-              <w:rPr>
-                <w:rFonts w:ascii="Aptos" w:hAnsi="Aptos"/>
-                <w:b/>
-                <w:i w:val="0"/>
-                <w:color w:val="00587A"/>
-                <w:sz w:val="15"/>
-              </w:rPr>
-              <w:t xml:space="preserve">AI Workflows: </w:t>
-            </w:r>
-            <w:r>
-              <w:rPr>
-                <w:rFonts w:ascii="Aptos" w:hAnsi="Aptos"/>
-                <w:b w:val="0"/>
-                <w:i w:val="0"/>
-                <w:color w:val="171D24"/>
-                <w:sz w:val="15"/>
-              </w:rPr>
-              <w:t>Agentic coding systems, repo-aware code generation, AI-assisted debugging/refactoring, test scaffolding, review prep</w:t>
-            </w:r>
-          </w:p>
-        </w:tc>
-        <w:tc>
-          <w:tcPr>
-            <w:tcW w:type="dxa" w:w="3629"/>
-            <w:tcMar>
-              <w:top w:w="55" w:type="dxa"/>
-              <w:start w:w="70" w:type="dxa"/>
-              <w:bottom w:w="55" w:type="dxa"/>
-              <w:end w:w="70" w:type="dxa"/>
-            </w:tcMar>
-            <w:shd w:fill="F7F9FB"/>
-          </w:tcPr>
-          <w:p>
-            <w:pPr>
-              <w:spacing w:after="0"/>
-            </w:pPr>
-            <w:r>
-              <w:rPr>
-                <w:rFonts w:ascii="Aptos" w:hAnsi="Aptos"/>
-                <w:b/>
-                <w:i w:val="0"/>
-                <w:color w:val="00587A"/>
-                <w:sz w:val="15"/>
-              </w:rPr>
-              <w:t xml:space="preserve">Systems Design: </w:t>
-            </w:r>
-            <w:r>
-              <w:rPr>
-                <w:rFonts w:ascii="Aptos" w:hAnsi="Aptos"/>
-                <w:b w:val="0"/>
-                <w:i w:val="0"/>
-                <w:color w:val="171D24"/>
-                <w:sz w:val="15"/>
-              </w:rPr>
-              <w:t>Server-authoritative projections, normalized/denormalized models, event handlers, shared domain libraries</w:t>
-            </w:r>
-          </w:p>
-        </w:tc>
-        <w:tc>
-          <w:tcPr>
-            <w:tcW w:type="dxa" w:w="3629"/>
-            <w:tcMar>
-              <w:top w:w="55" w:type="dxa"/>
-              <w:start w:w="70" w:type="dxa"/>
-              <w:bottom w:w="55" w:type="dxa"/>
-              <w:end w:w="70" w:type="dxa"/>
-            </w:tcMar>
-            <w:shd w:fill="F7F9FB"/>
-          </w:tcPr>
-          <w:p>
-            <w:pPr>
-              <w:spacing w:after="0"/>
-            </w:pPr>
-            <w:r>
-              <w:rPr>
-                <w:rFonts w:ascii="Aptos" w:hAnsi="Aptos"/>
-                <w:b/>
-                <w:i w:val="0"/>
-                <w:color w:val="00587A"/>
-                <w:sz w:val="15"/>
-              </w:rPr>
-              <w:t xml:space="preserve">Delivery Quality: </w:t>
-            </w:r>
-            <w:r>
-              <w:rPr>
-                <w:rFonts w:ascii="Aptos" w:hAnsi="Aptos"/>
-                <w:b w:val="0"/>
-                <w:i w:val="0"/>
-                <w:color w:val="171D24"/>
-                <w:sz w:val="15"/>
-              </w:rPr>
-              <w:t>Production reliability, canary rollouts, parity validation, regression discipline, feature flags, safe migration sequencing</w:t>
-            </w:r>
-          </w:p>
-        </w:tc>
-      </w:tr>
-    </w:tbl>
     <w:p>
       <w:pPr>
-        <w:spacing w:before="80" w:after="30"/>
+        <w:spacing w:after="34" w:line="245" w:lineRule="auto"/>
+        <w:ind w:left="43"/>
+      </w:pPr>
+      <w:r>
+        <w:rPr>
+          <w:rFonts w:ascii="Aptos" w:hAnsi="Aptos"/>
+          <w:b/>
+          <w:i w:val="0"/>
+          <w:color w:val="00587A"/>
+          <w:sz w:val="16"/>
+        </w:rPr>
+        <w:t xml:space="preserve">Frontend: </w:t>
+      </w:r>
+      <w:r>
+        <w:rPr>
+          <w:rFonts w:ascii="Aptos" w:hAnsi="Aptos"/>
+          <w:b w:val="0"/>
+          <w:i w:val="0"/>
+          <w:color w:val="171D24"/>
+          <w:sz w:val="16"/>
+        </w:rPr>
+        <w:t>React, TypeScript, JavaScript, Redux Toolkit, redux-observable/RxJS, AG Grid Enterprise, Module Federation, Cypress, Jest, Karma/Jasmine</w:t>
+      </w:r>
+    </w:p>
+    <w:p>
+      <w:pPr>
+        <w:spacing w:after="34" w:line="245" w:lineRule="auto"/>
+        <w:ind w:left="43"/>
+      </w:pPr>
+      <w:r>
+        <w:rPr>
+          <w:rFonts w:ascii="Aptos" w:hAnsi="Aptos"/>
+          <w:b/>
+          <w:i w:val="0"/>
+          <w:color w:val="00587A"/>
+          <w:sz w:val="16"/>
+        </w:rPr>
+        <w:t xml:space="preserve">Real-Time &amp; Backend: </w:t>
+      </w:r>
+      <w:r>
+        <w:rPr>
+          <w:rFonts w:ascii="Aptos" w:hAnsi="Aptos"/>
+          <w:b w:val="0"/>
+          <w:i w:val="0"/>
+          <w:color w:val="171D24"/>
+          <w:sz w:val="16"/>
+        </w:rPr>
+        <w:t>Java, WebSocket, REST APIs, Node.js, Python, SQL, event-driven/distributed systems, normalized and denormalized projections</w:t>
+      </w:r>
+    </w:p>
+    <w:p>
+      <w:pPr>
+        <w:spacing w:after="34" w:line="245" w:lineRule="auto"/>
+        <w:ind w:left="43"/>
+      </w:pPr>
+      <w:r>
+        <w:rPr>
+          <w:rFonts w:ascii="Aptos" w:hAnsi="Aptos"/>
+          <w:b/>
+          <w:i w:val="0"/>
+          <w:color w:val="00587A"/>
+          <w:sz w:val="16"/>
+        </w:rPr>
+        <w:t xml:space="preserve">Trading &amp; Delivery: </w:t>
+      </w:r>
+      <w:r>
+        <w:rPr>
+          <w:rFonts w:ascii="Aptos" w:hAnsi="Aptos"/>
+          <w:b w:val="0"/>
+          <w:i w:val="0"/>
+          <w:color w:val="171D24"/>
+          <w:sz w:val="16"/>
+        </w:rPr>
+        <w:t>Equity derivatives RFQ/RFS, DCM new issuance, pricing grids, P&amp;L/fees, CI/CD, LaunchDarkly, canary rollouts, production hardening</w:t>
+      </w:r>
+    </w:p>
+    <w:p>
+      <w:pPr>
+        <w:spacing w:after="34" w:line="245" w:lineRule="auto"/>
+        <w:ind w:left="43"/>
+      </w:pPr>
+      <w:r>
+        <w:rPr>
+          <w:rFonts w:ascii="Aptos" w:hAnsi="Aptos"/>
+          <w:b/>
+          <w:i w:val="0"/>
+          <w:color w:val="00587A"/>
+          <w:sz w:val="16"/>
+        </w:rPr>
+        <w:t xml:space="preserve">AI-Accelerated Engineering: </w:t>
+      </w:r>
+      <w:r>
+        <w:rPr>
+          <w:rFonts w:ascii="Aptos" w:hAnsi="Aptos"/>
+          <w:b w:val="0"/>
+          <w:i w:val="0"/>
+          <w:color w:val="171D24"/>
+          <w:sz w:val="16"/>
+        </w:rPr>
+        <w:t>Agentic coding systems, repo-aware code generation, debugging and refactoring, test design, and review workflows grounded in builds, tests, and human validation</w:t>
+      </w:r>
+    </w:p>
+    <w:p>
+      <w:pPr>
+        <w:spacing w:before="104" w:after="40"/>
         <w:pBdr>
           <w:bottom w:val="single" w:sz="6" w:space="2" w:color="B9C3CF"/>
         </w:pBdr>
@@ -463,18 +208,19 @@
     </w:p>
     <w:tbl>
       <w:tblPr>
-        <w:tblW w:type="dxa" w:w="10872"/>
-        <w:jc w:val="center"/>
+        <w:tblW w:type="dxa" w:w="10771"/>
+        <w:jc w:val="left"/>
+        <w:tblLayout w:type="fixed"/>
         <w:tblLook w:firstColumn="1" w:firstRow="1" w:lastColumn="0" w:lastRow="0" w:noHBand="0" w:noVBand="1" w:val="04A0"/>
       </w:tblPr>
       <w:tblGrid>
-        <w:gridCol w:w="8136"/>
-        <w:gridCol w:w="2736"/>
+        <w:gridCol w:w="7992"/>
+        <w:gridCol w:w="2779"/>
       </w:tblGrid>
       <w:tr>
         <w:tc>
           <w:tcPr>
-            <w:tcW w:type="dxa" w:w="5443"/>
+            <w:tcW w:type="dxa" w:w="7992"/>
             <w:vAlign w:val="center"/>
             <w:tcMar>
               <w:top w:w="0" w:type="dxa"/>
@@ -531,7 +277,7 @@
         </w:tc>
         <w:tc>
           <w:tcPr>
-            <w:tcW w:type="dxa" w:w="5443"/>
+            <w:tcW w:type="dxa" w:w="2779"/>
             <w:vAlign w:val="center"/>
             <w:tcMar>
               <w:top w:w="0" w:type="dxa"/>
@@ -561,8 +307,8 @@
     </w:tbl>
     <w:p>
       <w:pPr>
-        <w:pStyle w:val="ResumeBullet"/>
-        <w:spacing w:after="32"/>
+        <w:pStyle w:val="ListBullet"/>
+        <w:spacing w:after="47"/>
       </w:pPr>
       <w:r>
         <w:rPr>
@@ -570,15 +316,15 @@
           <w:b w:val="0"/>
           <w:i w:val="0"/>
           <w:color w:val="171D24"/>
-          <w:sz w:val="17"/>
+          <w:sz w:val="18"/>
         </w:rPr>
-        <w:t>Technical owner for a real-time, multi-leg pricing grid used by traders to price and structure equity-derivatives RFQ/RFS inquiries; owns the React/TypeScript UI, Java server tier, WebSocket stream, and declarative release configuration.</w:t>
+        <w:t>Own end-to-end delivery of a real-time, multi-leg pricing grid used by equity-derivatives traders to price and structure RFQ/RFS inquiries, spanning the React/TypeScript/AG Grid UI, Java pricing and streaming tier, WebSocket protocol, and release configuration.</w:t>
       </w:r>
     </w:p>
     <w:p>
       <w:pPr>
-        <w:pStyle w:val="ResumeBullet"/>
-        <w:spacing w:after="32"/>
+        <w:pStyle w:val="ListBullet"/>
+        <w:spacing w:after="47"/>
       </w:pPr>
       <w:r>
         <w:rPr>
@@ -586,15 +332,15 @@
           <w:b w:val="0"/>
           <w:i w:val="0"/>
           <w:color w:val="171D24"/>
-          <w:sz w:val="17"/>
+          <w:sz w:val="18"/>
         </w:rPr>
-        <w:t>Migrated a legacy client-heavy pricer to a server-authoritative, event-driven streaming architecture behind a feature canary, running old and new paths in parallel through layout/parity validation before retiring legacy code.</w:t>
+        <w:t>Led the incremental migration of a legacy client-heavy pricer to a server-authoritative, event-driven architecture; used a feature canary and parallel old/new-path validation to protect trader workflows while establishing parity and retiring legacy paths.</w:t>
       </w:r>
     </w:p>
     <w:p>
       <w:pPr>
-        <w:pStyle w:val="ResumeBullet"/>
-        <w:spacing w:after="32"/>
+        <w:pStyle w:val="ListBullet"/>
+        <w:spacing w:after="47"/>
       </w:pPr>
       <w:r>
         <w:rPr>
@@ -602,15 +348,15 @@
           <w:b w:val="0"/>
           <w:i w:val="0"/>
           <w:color w:val="171D24"/>
-          <w:sz w:val="17"/>
+          <w:sz w:val="18"/>
         </w:rPr>
-        <w:t>Implemented server-computed table layouts spanning tabs, columns, nested per-leg child grids, expansion state, styling, formatting, and cell renderers so the client stays thin and optimized for interaction/rendering.</w:t>
+        <w:t>Designed a server-computed layout model that streams tabs, columns, nested per-leg grids, expansion state, styling, formatting, and cell-renderer metadata, keeping the browser focused on fast rendering and interaction rather than layout computation.</w:t>
       </w:r>
     </w:p>
     <w:p>
       <w:pPr>
-        <w:pStyle w:val="ResumeBullet"/>
-        <w:spacing w:after="32"/>
+        <w:pStyle w:val="ListBullet"/>
+        <w:spacing w:after="47"/>
       </w:pPr>
       <w:r>
         <w:rPr>
@@ -618,15 +364,15 @@
           <w:b w:val="0"/>
           <w:i w:val="0"/>
           <w:color w:val="171D24"/>
-          <w:sz w:val="16"/>
+          <w:sz w:val="18"/>
         </w:rPr>
-        <w:t>Modeled both normalized and denormalized projections for the same portfolio, enabling single-table and per-leg nested-grid views from a shared server-side layout engine and preserving parity with legacy trader workflows.</w:t>
+        <w:t>Built normalized and denormalized projections from a shared domain model and diff-based WebSocket publishing, sending only changed structure and removing redundant per-event fields to reduce payload churn on a latency-sensitive path.</w:t>
       </w:r>
     </w:p>
     <w:p>
       <w:pPr>
-        <w:pStyle w:val="ResumeBullet"/>
-        <w:spacing w:after="32"/>
+        <w:pStyle w:val="ListBullet"/>
+        <w:spacing w:after="47"/>
       </w:pPr>
       <w:r>
         <w:rPr>
@@ -634,15 +380,15 @@
           <w:b w:val="0"/>
           <w:i w:val="0"/>
           <w:color w:val="171D24"/>
-          <w:sz w:val="17"/>
+          <w:sz w:val="18"/>
         </w:rPr>
-        <w:t>Reduced redundant per-tick WebSocket payloads by publishing only changed table structure through value-equality / diff-based streaming and removing fields serialized on every market or valuation event.</w:t>
+        <w:t>Delivered approximately 100 tracked work items across UI, Java services, and release configuration in 12 months, including 188 commits on the pricing-grid/data layer and 35 of 38 server-tier commits in the core pricing engine.</w:t>
       </w:r>
     </w:p>
     <w:p>
       <w:pPr>
-        <w:pStyle w:val="ResumeBullet"/>
-        <w:spacing w:after="32"/>
+        <w:pStyle w:val="ListBullet"/>
+        <w:spacing w:after="64"/>
       </w:pPr>
       <w:r>
         <w:rPr>
@@ -650,41 +396,26 @@
           <w:b w:val="0"/>
           <w:i w:val="0"/>
           <w:color w:val="171D24"/>
-          <w:sz w:val="16"/>
+          <w:sz w:val="18"/>
         </w:rPr>
-        <w:t>Delivered 378 commits across 1,437 files over 12 months (+55,204 / -19,575 LOC), including 188 commits on the pricing-grid/data layer and 35 of 38 server-tier commits in the core pricing engine.</w:t>
-      </w:r>
-    </w:p>
-    <w:p>
-      <w:pPr>
-        <w:pStyle w:val="ResumeBullet"/>
-        <w:spacing w:after="32"/>
-      </w:pPr>
-      <w:r>
-        <w:rPr>
-          <w:rFonts w:ascii="Aptos" w:hAnsi="Aptos"/>
-          <w:b w:val="0"/>
-          <w:i w:val="0"/>
-          <w:color w:val="171D24"/>
-          <w:sz w:val="16"/>
-        </w:rPr>
-        <w:t>Uses AI-assisted and agentic engineering workflows for codebase search, implementation planning, refactor decomposition, test-case ideation, and review checklists while grounding changes in local builds, specs, and production constraints.</w:t>
+        <w:t>Use AI-assisted and agentic engineering workflows for repository-scale navigation, implementation planning, debugging, refactor decomposition, test design, and review, validating outputs against local builds, specifications, and production constraints.</w:t>
       </w:r>
     </w:p>
     <w:tbl>
       <w:tblPr>
-        <w:tblW w:type="dxa" w:w="10872"/>
-        <w:jc w:val="center"/>
+        <w:tblW w:type="dxa" w:w="10771"/>
+        <w:jc w:val="left"/>
+        <w:tblLayout w:type="fixed"/>
         <w:tblLook w:firstColumn="1" w:firstRow="1" w:lastColumn="0" w:lastRow="0" w:noHBand="0" w:noVBand="1" w:val="04A0"/>
       </w:tblPr>
       <w:tblGrid>
-        <w:gridCol w:w="8136"/>
-        <w:gridCol w:w="2736"/>
+        <w:gridCol w:w="7992"/>
+        <w:gridCol w:w="2779"/>
       </w:tblGrid>
       <w:tr>
         <w:tc>
           <w:tcPr>
-            <w:tcW w:type="dxa" w:w="5443"/>
+            <w:tcW w:type="dxa" w:w="7992"/>
             <w:vAlign w:val="center"/>
             <w:tcMar>
               <w:top w:w="0" w:type="dxa"/>
@@ -741,7 +472,7 @@
         </w:tc>
         <w:tc>
           <w:tcPr>
-            <w:tcW w:type="dxa" w:w="5443"/>
+            <w:tcW w:type="dxa" w:w="2779"/>
             <w:vAlign w:val="center"/>
             <w:tcMar>
               <w:top w:w="0" w:type="dxa"/>
@@ -771,8 +502,8 @@
     </w:tbl>
     <w:p>
       <w:pPr>
-        <w:pStyle w:val="ResumeBullet"/>
-        <w:spacing w:after="32"/>
+        <w:pStyle w:val="ListBullet"/>
+        <w:spacing w:after="47"/>
       </w:pPr>
       <w:r>
         <w:rPr>
@@ -780,15 +511,15 @@
           <w:b w:val="0"/>
           <w:i w:val="0"/>
           <w:color w:val="171D24"/>
-          <w:sz w:val="17"/>
+          <w:sz w:val="18"/>
         </w:rPr>
-        <w:t>Owned two production trading applications used daily by syndicate bankers, traders, and capital-markets originators for bond and loan new-issue workflows: investor targeting, demand aggregation, pricing/allocation, trade booking, and P&amp;L / fee reconciliation.</w:t>
+        <w:t>Owned two production capital-markets applications used daily for bond and loan new-issue workflows, from investor targeting and demand aggregation through pricing, allocation, trade booking, and P&amp;L/fee reconciliation.</w:t>
       </w:r>
     </w:p>
     <w:p>
       <w:pPr>
-        <w:pStyle w:val="ResumeBullet"/>
-        <w:spacing w:after="32"/>
+        <w:pStyle w:val="ListBullet"/>
+        <w:spacing w:after="47"/>
       </w:pPr>
       <w:r>
         <w:rPr>
@@ -796,15 +527,15 @@
           <w:b w:val="0"/>
           <w:i w:val="0"/>
           <w:color w:val="171D24"/>
-          <w:sz w:val="17"/>
+          <w:sz w:val="18"/>
         </w:rPr>
-        <w:t>Built AG Grid-heavy React/TypeScript surfaces across two state paradigms: a Redux Toolkit / Module Federation investor-analytics host and a classic Redux + redux-observable syndicate-link platform.</w:t>
+        <w:t>Built dense, keyboard-driven React/TypeScript and AG Grid workflows across Redux Toolkit/Module Federation and Redux/redux-observable (RxJS), integrating real-time updates and domain REST services.</w:t>
       </w:r>
     </w:p>
     <w:p>
       <w:pPr>
-        <w:pStyle w:val="ResumeBullet"/>
-        <w:spacing w:after="32"/>
+        <w:pStyle w:val="ListBullet"/>
+        <w:spacing w:after="47"/>
       </w:pPr>
       <w:r>
         <w:rPr>
@@ -812,15 +543,15 @@
           <w:b w:val="0"/>
           <w:i w:val="0"/>
           <w:color w:val="171D24"/>
-          <w:sz w:val="16"/>
+          <w:sz w:val="18"/>
         </w:rPr>
-        <w:t>Maintained a Module Federation host that loaded federated investor-analytics remotes with runtime-injected origins across dev / QA / prod while keeping shared React/Redux dependencies singleton-safe.</w:t>
+        <w:t>Operated an investor-analytics platform as a Module Federation host, loading remote applications through runtime-injected origins across development, QA, and production while keeping shared React/Redux dependencies singleton-safe.</w:t>
       </w:r>
     </w:p>
     <w:p>
       <w:pPr>
-        <w:pStyle w:val="ResumeBullet"/>
-        <w:spacing w:after="32"/>
+        <w:pStyle w:val="ListBullet"/>
+        <w:spacing w:after="47"/>
       </w:pPr>
       <w:r>
         <w:rPr>
@@ -828,15 +559,15 @@
           <w:b w:val="0"/>
           <w:i w:val="0"/>
           <w:color w:val="171D24"/>
-          <w:sz w:val="17"/>
+          <w:sz w:val="18"/>
         </w:rPr>
-        <w:t>Built a cross-tab user-preferences framework for major grid views, persisting per-user column order, visibility, widths, pin state, and drag/reorder rules while unifying CSV/Excel export behavior with on-screen layout.</w:t>
+        <w:t>Created a reusable cross-tab grid-preferences and export framework that persisted each user's column order, visibility, widths, pinning, and reorder rules while keeping CSV/Excel output aligned with the on-screen layout.</w:t>
       </w:r>
     </w:p>
     <w:p>
       <w:pPr>
-        <w:pStyle w:val="ResumeBullet"/>
-        <w:spacing w:after="32"/>
+        <w:pStyle w:val="ListBullet"/>
+        <w:spacing w:after="47"/>
       </w:pPr>
       <w:r>
         <w:rPr>
@@ -844,15 +575,15 @@
           <w:b w:val="0"/>
           <w:i w:val="0"/>
           <w:color w:val="171D24"/>
-          <w:sz w:val="17"/>
+          <w:sz w:val="18"/>
         </w:rPr>
-        <w:t>Owned the syndicate-link P&amp;L tab end-to-end, including GS Fees, Controllers Flash, Synd Fees, and Deal Table grids, with editable cell navigation, dirty-field highlighting, precision rules, value setters, and audit labeling.</w:t>
+        <w:t>Delivered P&amp;L/fee editing and investor-participation workflows end-to-end, including tab-and-enter navigation, dirty-state cues, precision rules, multi-currency aggregation, API integration, authorization gating, and export parity.</w:t>
       </w:r>
     </w:p>
     <w:p>
       <w:pPr>
-        <w:pStyle w:val="ResumeBullet"/>
-        <w:spacing w:after="32"/>
+        <w:pStyle w:val="ListBullet"/>
+        <w:spacing w:after="47"/>
       </w:pPr>
       <w:r>
         <w:rPr>
@@ -860,15 +591,15 @@
           <w:b w:val="0"/>
           <w:i w:val="0"/>
           <w:color w:val="171D24"/>
-          <w:sz w:val="17"/>
+          <w:sz w:val="18"/>
         </w:rPr>
-        <w:t>Led an investor-participation query workflow from input form to API, grid, and export, including multi-currency demand aggregation, conversion toggles, incompatible-mode suppression, export parity, and user-group tab gating.</w:t>
+        <w:t>Managed a versioned Funds Flow UI package integration through branch-conditional CI install rules, allowing integration testing against candidate upstream releases without destabilizing production release branches.</w:t>
       </w:r>
     </w:p>
     <w:p>
       <w:pPr>
-        <w:pStyle w:val="ResumeBullet"/>
-        <w:spacing w:after="32"/>
+        <w:pStyle w:val="ListBullet"/>
+        <w:spacing w:after="64"/>
       </w:pPr>
       <w:r>
         <w:rPr>
@@ -876,41 +607,26 @@
           <w:b w:val="0"/>
           <w:i w:val="0"/>
           <w:color w:val="171D24"/>
-          <w:sz w:val="16"/>
+          <w:sz w:val="18"/>
         </w:rPr>
-        <w:t>Managed Funds Flow integration through versioned NPM packages and branch-conditional CI install rules so integration testing could float against upstream releases without destabilizing production trains.</w:t>
-      </w:r>
-    </w:p>
-    <w:p>
-      <w:pPr>
-        <w:pStyle w:val="ResumeBullet"/>
-        <w:spacing w:after="32"/>
-      </w:pPr>
-      <w:r>
-        <w:rPr>
-          <w:rFonts w:ascii="Aptos" w:hAnsi="Aptos"/>
-          <w:b w:val="0"/>
-          <w:i w:val="0"/>
-          <w:color w:val="171D24"/>
-          <w:sz w:val="16"/>
-        </w:rPr>
-        <w:t>Drove framework and dependency migrations across managed CI/CD pipelines, including React 17 to 18, AG Grid 23 to 30, node-sass removal, Highcharts upgrades, LaunchDarkly SDK upgrades, GS UI Toolkit upgrades, and Node/NPM version bumps.</w:t>
+        <w:t>Modernized both platforms through React 17-to-18 and AG Grid 23-to-30 migrations, node-sass removal, LaunchDarkly/UI toolkit/Node upgrades, Module Federation release configuration, and partner-package integration across managed CI/CD pipelines.</w:t>
       </w:r>
     </w:p>
     <w:tbl>
       <w:tblPr>
-        <w:tblW w:type="dxa" w:w="10872"/>
-        <w:jc w:val="center"/>
+        <w:tblW w:type="dxa" w:w="10771"/>
+        <w:jc w:val="left"/>
+        <w:tblLayout w:type="fixed"/>
         <w:tblLook w:firstColumn="1" w:firstRow="1" w:lastColumn="0" w:lastRow="0" w:noHBand="0" w:noVBand="1" w:val="04A0"/>
       </w:tblPr>
       <w:tblGrid>
-        <w:gridCol w:w="8136"/>
-        <w:gridCol w:w="2736"/>
+        <w:gridCol w:w="7992"/>
+        <w:gridCol w:w="2779"/>
       </w:tblGrid>
       <w:tr>
         <w:tc>
           <w:tcPr>
-            <w:tcW w:type="dxa" w:w="5443"/>
+            <w:tcW w:type="dxa" w:w="7992"/>
             <w:vAlign w:val="center"/>
             <w:tcMar>
               <w:top w:w="0" w:type="dxa"/>
@@ -967,7 +683,7 @@
         </w:tc>
         <w:tc>
           <w:tcPr>
-            <w:tcW w:type="dxa" w:w="5443"/>
+            <w:tcW w:type="dxa" w:w="2779"/>
             <w:vAlign w:val="center"/>
             <w:tcMar>
               <w:top w:w="0" w:type="dxa"/>
@@ -997,8 +713,8 @@
     </w:tbl>
     <w:p>
       <w:pPr>
-        <w:pStyle w:val="ResumeBullet"/>
-        <w:spacing w:after="20"/>
+        <w:pStyle w:val="ListBullet"/>
+        <w:spacing w:after="47"/>
       </w:pPr>
       <w:r>
         <w:rPr>
@@ -1006,14 +722,14 @@
           <w:b w:val="0"/>
           <w:i w:val="0"/>
           <w:color w:val="171D24"/>
-          <w:sz w:val="16"/>
+          <w:sz w:val="18"/>
         </w:rPr>
-        <w:t>Returned full-time after internship; built production engineering context in a regulated financial-services environment.</w:t>
+        <w:t>Earned a return offer after building production engineering experience in a regulated financial-services environment.</w:t>
       </w:r>
     </w:p>
     <w:p>
       <w:pPr>
-        <w:spacing w:before="80" w:after="30"/>
+        <w:spacing w:before="104" w:after="40"/>
         <w:pBdr>
           <w:bottom w:val="single" w:sz="6" w:space="2" w:color="B9C3CF"/>
         </w:pBdr>
@@ -1026,23 +742,24 @@
           <w:color w:val="00587A"/>
           <w:sz w:val="19"/>
         </w:rPr>
-        <w:t>EDUCATION, CERTIFICATIONS &amp; LEADERSHIP</w:t>
+        <w:t>EDUCATION, LEADERSHIP &amp; CREDENTIALS</w:t>
       </w:r>
     </w:p>
     <w:tbl>
       <w:tblPr>
-        <w:tblW w:type="dxa" w:w="10872"/>
-        <w:jc w:val="center"/>
+        <w:tblW w:type="dxa" w:w="10771"/>
+        <w:jc w:val="left"/>
+        <w:tblLayout w:type="fixed"/>
         <w:tblLook w:firstColumn="1" w:firstRow="1" w:lastColumn="0" w:lastRow="0" w:noHBand="0" w:noVBand="1" w:val="04A0"/>
       </w:tblPr>
       <w:tblGrid>
-        <w:gridCol w:w="8136"/>
-        <w:gridCol w:w="2736"/>
+        <w:gridCol w:w="7992"/>
+        <w:gridCol w:w="2779"/>
       </w:tblGrid>
       <w:tr>
         <w:tc>
           <w:tcPr>
-            <w:tcW w:type="dxa" w:w="5443"/>
+            <w:tcW w:type="dxa" w:w="7992"/>
             <w:vAlign w:val="center"/>
             <w:tcMar>
               <w:top w:w="0" w:type="dxa"/>
@@ -1083,13 +800,13 @@
                 <w:color w:val="171D24"/>
                 <w:sz w:val="18"/>
               </w:rPr>
-              <w:t>M.S., Computer and Information Systems - Machine Learning Concentration</w:t>
+              <w:t>M.S., Computer &amp; Information Systems (Machine Learning)</w:t>
             </w:r>
           </w:p>
         </w:tc>
         <w:tc>
           <w:tcPr>
-            <w:tcW w:type="dxa" w:w="5443"/>
+            <w:tcW w:type="dxa" w:w="2779"/>
             <w:vAlign w:val="center"/>
             <w:tcMar>
               <w:top w:w="0" w:type="dxa"/>
@@ -1119,8 +836,8 @@
     </w:tbl>
     <w:p>
       <w:pPr>
-        <w:pStyle w:val="ResumeBullet"/>
-        <w:spacing w:after="16"/>
+        <w:pStyle w:val="ListBullet"/>
+        <w:spacing w:after="20"/>
       </w:pPr>
       <w:r>
         <w:rPr>
@@ -1128,14 +845,14 @@
           <w:b w:val="0"/>
           <w:i w:val="0"/>
           <w:color w:val="171D24"/>
-          <w:sz w:val="16"/>
+          <w:sz w:val="18"/>
         </w:rPr>
-        <w:t>Technical Chairman, USF Society of Competitive Programmers; led ICPC-style preparation, coached students through algorithmic problem solving, and built training around data structures, complexity, correctness, and reasoning under constraints.</w:t>
+        <w:t>Technical Chairman, USF Society of Competitive Programmers - prepared and coached students for ICPC competitions, teaching data structures, algorithms, complexity analysis, correctness, and systematic problem solving under time constraints.</w:t>
       </w:r>
     </w:p>
     <w:p>
       <w:pPr>
-        <w:pStyle w:val="ResumeBullet"/>
+        <w:pStyle w:val="ListBullet"/>
         <w:spacing w:after="0"/>
       </w:pPr>
       <w:r>
@@ -1144,15 +861,15 @@
           <w:b w:val="0"/>
           <w:i w:val="0"/>
           <w:color w:val="171D24"/>
-          <w:sz w:val="16"/>
+          <w:sz w:val="18"/>
         </w:rPr>
-        <w:t>Oracle Certified Professional, Java SE 8 Programmer II; Oracle Certified Associate, Java SE 8 Programmer. Bilingual English / Spanish.</w:t>
+        <w:t>Oracle Certified Professional, Java SE 8 Programmer II; Oracle Certified Associate, Java SE 8 Programmer | Bilingual English/Spanish</w:t>
       </w:r>
     </w:p>
     <w:sectPr>
       <w:footerReference w:type="default" r:id="rId9"/>
       <w:pgSz w:w="12240" w:h="15840"/>
-      <w:pgMar w:top="547" w:right="677" w:bottom="547" w:left="677" w:header="288" w:footer="288" w:gutter="0"/>
+      <w:pgMar w:top="547" w:right="734" w:bottom="547" w:left="734" w:header="288" w:footer="288" w:gutter="0"/>
       <w:cols w:space="720"/>
       <w:docGrid w:linePitch="360"/>
     </w:sectPr>
@@ -1534,7 +1251,7 @@
     <w:qFormat/>
     <w:rsid w:val="00FC693F"/>
     <w:pPr>
-      <w:spacing w:after="40" w:line="247" w:lineRule="auto"/>
+      <w:spacing w:after="36" w:line="245" w:lineRule="auto"/>
     </w:pPr>
     <w:rPr>
       <w:rFonts w:ascii="Aptos" w:hAnsi="Aptos"/>
@@ -2068,8 +1785,15 @@
       <w:numPr>
         <w:numId w:val="1"/>
       </w:numPr>
+      <w:spacing w:after="49" w:line="250" w:lineRule="auto"/>
+      <w:ind w:left="317" w:hanging="202"/>
       <w:contextualSpacing/>
     </w:pPr>
+    <w:rPr>
+      <w:rFonts w:ascii="Aptos" w:hAnsi="Aptos"/>
+      <w:color w:val="171D24"/>
+      <w:sz w:val="18"/>
+    </w:rPr>
   </w:style>
   <w:style w:type="paragraph" w:styleId="ListBullet2">
     <w:name w:val="List Bullet 2"/>
@@ -13223,14 +12947,6 @@
         <w:shd w:val="clear" w:color="auto" w:fill="FBCAA2" w:themeFill="accent6" w:themeFillTint="7F"/>
       </w:tcPr>
     </w:tblStylePr>
-  </w:style>
-  <w:style w:type="paragraph" w:customStyle="1" w:styleId="ResumeBullet">
-    <w:name w:val="Resume Bullet"/>
-    <w:basedOn w:val="Normal"/>
-    <w:pPr>
-      <w:spacing w:after="32" w:line="245" w:lineRule="auto"/>
-      <w:ind w:left="245" w:hanging="158"/>
-    </w:pPr>
   </w:style>
 </w:styles>
 </file>

</xml_diff>